<commit_message>
Updated the readme and KT doc
</commit_message>
<xml_diff>
--- a/KT_LowVol_Strategy.docx
+++ b/KT_LowVol_Strategy.docx
@@ -67,7 +67,7 @@
         <w:rPr>
           <w:sz w:val="20"/>
         </w:rPr>
-        <w:t>Written for the researcher, quant, or PM who continues this work after the author leaves the firm. It explains what was researched, what was found, what was tried and rejected, and exactly which files to open and in what order. Every claim below was checked directly against the actual notebook code, the actual generated output files (Excel/CSV), or both  -  not only against the prior prose reports. Anywhere a prior claim could not be verified, or was found to be wrong, it is flagged explicitly rather than restated.</w:t>
+        <w:t>Written for the researcher, quant, or PM who continues this work after the author leaves the firm. It explains what was researched, what was found, what was tried and rejected, and exactly which files to open and in what order. Every claim in this document was checked directly against the actual notebook code and the actual generated output files (Excel/CSV). Anywhere something could not be verified from source, that is flagged explicitly rather than stated as fact.</w:t>
       </w:r>
     </w:p>
     <w:p>
@@ -1416,7 +1416,7 @@
               <w:rPr>
                 <w:sz w:val="18"/>
               </w:rPr>
-              <w:t>Confirmed present (contrary to a documentation doubt raised during this review)  -  builds index values/rebalancing/transaction costs and computes CAGR, Sharpe, Sortino, XIRR.</w:t>
+              <w:t>Builds index values, rebalancing, and transaction costs; computes CAGR, Sharpe, Sortino, XIRR.</w:t>
             </w:r>
           </w:p>
         </w:tc>
@@ -3002,7 +3002,7 @@
         <w:rPr>
           <w:sz w:val="20"/>
         </w:rPr>
-        <w:t>The NSE Top-50 universe used across the entire 6-year backtest is derived from mcap_based_universe_202602251340.csv, which was directly inspected and found to be a full historical market-cap table (526,104 rows, ~3,000 tickers per date, 2005-2026) rather than a pre-filtered Top-50 snapshot. Whatever Top-50 cut is used is applied retroactively using a Feb-2026 vantage point  -  i.e. today's biggest 50 companies are assumed to have also been the biggest 50 in 2020. This forward-looking-bias risk is already flagged in the research report; it is restated here because the underlying data file's true nature (full market table, not a snapshot) was not previously clear.</w:t>
+        <w:t>The NSE Top-50 universe used across the entire 6-year backtest is derived from mcap_based_universe_202602251340.csv, a full historical market-cap table (526,104 rows, ~3,000 tickers per date, 2005-2026) rather than a pre-filtered Top-50 snapshot. Whatever Top-50 cut is used is applied retroactively using a Feb-2026 vantage point  -  i.e. today's biggest 50 companies are assumed to have also been the biggest 50 in 2020. This forward-looking-bias risk is also noted in the research report.</w:t>
       </w:r>
     </w:p>
     <w:p>
@@ -3050,7 +3050,7 @@
           <w:b w:val="0"/>
           <w:sz w:val="20"/>
         </w:rPr>
-        <w:t>There are 15+ research notebooks. Most are exploratory or superseded  -  you do not need to open all of them. This tiering was corrected during this review against what each notebook was directly confirmed to contain; several notebooks were previously mis-credited in an earlier version of this document (see the Tier 3 notes below for specifics).</w:t>
+        <w:t>There are 15+ research notebooks. Most are exploratory or superseded  -  you do not need to open all of them. This tiering reflects what each notebook was directly confirmed to contain by reading its actual code and outputs.</w:t>
       </w:r>
     </w:p>
     <w:p/>
@@ -3298,7 +3298,7 @@
           <w:color w:val="FFFFFF"/>
           <w:sz w:val="22"/>
         </w:rPr>
-        <w:t xml:space="preserve">  TIER 3 - Skip (superseded / previously mis-credited)</w:t>
+        <w:t xml:space="preserve">  TIER 3 - Skip (superseded)</w:t>
       </w:r>
     </w:p>
     <w:p>
@@ -3307,7 +3307,7 @@
           <w:b w:val="0"/>
           <w:sz w:val="18"/>
         </w:rPr>
-        <w:t>These notebooks are either genuinely superseded scratch work, or were found during this review to NOT contain what an earlier version of this document credited them with. Both categories are safe to skip; the corrections are noted so you do not go looking for something that isn't there.</w:t>
+        <w:t>These notebooks are exploratory or superseded scratch work. Safe to skip.</w:t>
       </w:r>
     </w:p>
     <w:p/>
@@ -3388,7 +3388,7 @@
               <w:rPr>
                 <w:sz w:val="18"/>
               </w:rPr>
-              <w:t>CORRECTED: does not contain the Fixed-10/Dynamic/Gap comparison it was previously credited with. It is a calibration-script copy plus an EqW-vs-InvVol test already superseded by strategy_comparison.ipynb. The "7.6 stocks/month" and "28.9% turnover" stats actually live in dynamic_low_vol_selection.ipynb and strategy_comparison.ipynb respectively.</w:t>
+              <w:t>A calibration-script copy plus an EqW-vs-InvVol test, superseded by strategy_comparison.ipynb. Does not contain a Fixed-10/Dynamic/Gap-Regime comparison. The "7.6 stocks/month" and "28.9% turnover" stats live in dynamic_low_vol_selection.ipynb and strategy_comparison.ipynb respectively.</w:t>
             </w:r>
           </w:p>
         </w:tc>
@@ -3418,7 +3418,7 @@
               <w:rPr>
                 <w:sz w:val="18"/>
               </w:rPr>
-              <w:t>CORRECTED: does not combine the three strategies into a unified backtest as previously claimed. Structurally duplicates Weekly_rebal_motifs.ipynb's motif pipeline.</w:t>
+              <w:t>Structurally duplicates Weekly_rebal_motifs.ipynb's motif pipeline; does not combine the three strategies into a unified backtest.</w:t>
             </w:r>
           </w:p>
         </w:tc>
@@ -3448,7 +3448,7 @@
               <w:rPr>
                 <w:sz w:val="18"/>
               </w:rPr>
-              <w:t>CORRECTED: not macro/FX/fixed-income work. Another near-duplicate of the motif pipeline. The real macro-variable to-do list lives only in "Volatility Research for AA smallcases.docx" and was never started in code.</w:t>
+              <w:t>A near-duplicate of the motif pipeline, not macro/FX/fixed-income work. The real macro-variable to-do list lives only in "Volatility Research for AA smallcases.docx" and was never started in code.</w:t>
             </w:r>
           </w:p>
         </w:tc>
@@ -3478,7 +3478,7 @@
               <w:rPr>
                 <w:sz w:val="18"/>
               </w:rPr>
-              <w:t>Confirmed early/duplicated Phase-1 GARCH/FIGARCH scratch work, superseded by the MASS approach.</w:t>
+              <w:t>Early/duplicated Phase-1 GARCH/FIGARCH scratch work, superseded by the MASS approach.</w:t>
             </w:r>
           </w:p>
         </w:tc>
@@ -4277,7 +4277,7 @@
               <w:rPr>
                 <w:sz w:val="18"/>
               </w:rPr>
-              <w:t>FX, commodities, global equities, fixed income, PE/PB/Div yield across 7 market-cap + 18 sectoral indices  -  fully scoped as a to-do list in "Volatility Research for AA smallcases.docx," but confirmed NOT started in any notebook (extended_analysis.ipynb, previously credited with this, is actually a motif-pipeline duplicate).</w:t>
+              <w:t>FX, commodities, global equities, fixed income, PE/PB/Div yield across 7 market-cap + 18 sectoral indices  -  fully scoped as a to-do list in "Volatility Research for AA smallcases.docx," but confirmed NOT started in any notebook (see Section 7).</w:t>
             </w:r>
           </w:p>
         </w:tc>
@@ -4808,7 +4808,7 @@
               <w:rPr>
                 <w:sz w:val="18"/>
               </w:rPr>
-              <w:t>See Tier 3, Section 7  -  includes corrections to previously mis-credited notebooks.</w:t>
+              <w:t>See Tier 3, Section 7.</w:t>
             </w:r>
           </w:p>
         </w:tc>

</xml_diff>